<commit_message>
Update data model and age reference tests
</commit_message>
<xml_diff>
--- a/docs/260919 Datamodell v01b.docx
+++ b/docs/260919 Datamodell v01b.docx
@@ -379,19 +379,11 @@
               <w:rPr>
                 <w:lang w:val="sv-SE"/>
               </w:rPr>
-              <w:t xml:space="preserve"> </w:t>
-            </w:r>
-            <w:r>
-              <w:rPr>
-                <w:highlight w:val="yellow"/>
-                <w:lang w:val="sv-SE"/>
-              </w:rPr>
-              <w:t xml:space="preserve">Tillåtna kombinationer: </w:t>
-            </w:r>
-            <w:proofErr w:type="spellStart"/>
-            <w:r>
-              <w:rPr>
-                <w:highlight w:val="yellow"/>
+              <w:t xml:space="preserve"> Tillåtna kombinationer: </w:t>
+            </w:r>
+            <w:proofErr w:type="spellStart"/>
+            <w:r>
+              <w:rPr>
                 <w:lang w:val="sv-SE"/>
               </w:rPr>
               <w:t>sant+falskt</w:t>
@@ -399,7 +391,6 @@
             <w:proofErr w:type="spellEnd"/>
             <w:r>
               <w:rPr>
-                <w:highlight w:val="yellow"/>
                 <w:lang w:val="sv-SE"/>
               </w:rPr>
               <w:t xml:space="preserve"> (pojke), </w:t>
@@ -407,7 +398,6 @@
             <w:proofErr w:type="spellStart"/>
             <w:r>
               <w:rPr>
-                <w:highlight w:val="yellow"/>
                 <w:lang w:val="sv-SE"/>
               </w:rPr>
               <w:t>falskt+sant</w:t>
@@ -415,7 +405,6 @@
             <w:proofErr w:type="spellEnd"/>
             <w:r>
               <w:rPr>
-                <w:highlight w:val="yellow"/>
                 <w:lang w:val="sv-SE"/>
               </w:rPr>
               <w:t xml:space="preserve"> (flicka) och </w:t>
@@ -423,7 +412,6 @@
             <w:proofErr w:type="spellStart"/>
             <w:r>
               <w:rPr>
-                <w:highlight w:val="yellow"/>
                 <w:lang w:val="sv-SE"/>
               </w:rPr>
               <w:t>falskt+falskt</w:t>
@@ -431,16 +419,9 @@
             <w:proofErr w:type="spellEnd"/>
             <w:r>
               <w:rPr>
-                <w:highlight w:val="yellow"/>
-                <w:lang w:val="sv-SE"/>
-              </w:rPr>
-              <w:t xml:space="preserve"> (kön inte angett).</w:t>
-            </w:r>
-            <w:r>
-              <w:rPr>
-                <w:lang w:val="sv-SE"/>
-              </w:rPr>
-              <w:t xml:space="preserve"> </w:t>
+                <w:lang w:val="sv-SE"/>
+              </w:rPr>
+              <w:t xml:space="preserve"> (kön inte angett). </w:t>
             </w:r>
             <w:r>
               <w:rPr>
@@ -522,13 +503,7 @@
               <w:rPr>
                 <w:lang w:val="sv-SE"/>
               </w:rPr>
-              <w:t>Rad 2.</w:t>
-            </w:r>
-            <w:r>
-              <w:rPr>
-                <w:lang w:val="sv-SE"/>
-              </w:rPr>
-              <w:t xml:space="preserve"> (Som två booleska värden</w:t>
+              <w:t>Rad 2. (Som två booleska värden</w:t>
             </w:r>
             <w:r>
               <w:rPr>
@@ -1087,7 +1062,19 @@
                 <w:lang w:val="sv-SE"/>
               </w:rPr>
               <w:lastRenderedPageBreak/>
-              <w:t>automatiska uträkningen visar en ålder i displayformatet som är lägre än 1:6 eller högre än 99:11</w:t>
+              <w:t xml:space="preserve">automatiska uträkningen </w:t>
+            </w:r>
+            <w:r>
+              <w:rPr>
+                <w:lang w:val="sv-SE"/>
+              </w:rPr>
+              <w:t>skulle ge</w:t>
+            </w:r>
+            <w:r>
+              <w:rPr>
+                <w:lang w:val="sv-SE"/>
+              </w:rPr>
+              <w:t xml:space="preserve"> en ålder i displayformatet som är lägre än 1:6 eller högre än 99:11</w:t>
             </w:r>
             <w:r>
               <w:rPr>
@@ -1099,7 +1086,109 @@
               <w:rPr>
                 <w:lang w:val="sv-SE"/>
               </w:rPr>
-              <w:t xml:space="preserve">, men tillåter att gå vidare utan rättning. Strängare kontroll före sparande/beräkning som ger dialogruta med valet att ändra felaktigt datum eller gå vidare, om går vidare </w:t>
+              <w:t xml:space="preserve">, men tillåter att gå vidare utan rättning. </w:t>
+            </w:r>
+            <w:r>
+              <w:rPr>
+                <w:lang w:val="sv-SE"/>
+              </w:rPr>
+              <w:t xml:space="preserve">I sådant fall </w:t>
+            </w:r>
+            <w:r>
+              <w:rPr>
+                <w:lang w:val="sv-SE"/>
+              </w:rPr>
+              <w:t>behåll</w:t>
+            </w:r>
+            <w:r>
+              <w:rPr>
+                <w:lang w:val="sv-SE"/>
+              </w:rPr>
+              <w:t>s</w:t>
+            </w:r>
+            <w:r>
+              <w:rPr>
+                <w:lang w:val="sv-SE"/>
+              </w:rPr>
+              <w:t xml:space="preserve"> eventuell manuell text </w:t>
+            </w:r>
+            <w:r>
+              <w:rPr>
+                <w:lang w:val="sv-SE"/>
+              </w:rPr>
+              <w:t xml:space="preserve">i </w:t>
+            </w:r>
+            <w:proofErr w:type="spellStart"/>
+            <w:r>
+              <w:rPr>
+                <w:lang w:val="sv-SE"/>
+              </w:rPr>
+              <w:t>Alder</w:t>
+            </w:r>
+            <w:proofErr w:type="spellEnd"/>
+            <w:r>
+              <w:rPr>
+                <w:lang w:val="sv-SE"/>
+              </w:rPr>
+              <w:t xml:space="preserve">, </w:t>
+            </w:r>
+            <w:r>
+              <w:rPr>
+                <w:lang w:val="sv-SE"/>
+              </w:rPr>
+              <w:t xml:space="preserve">eller tidigare automatisk text </w:t>
+            </w:r>
+            <w:r>
+              <w:rPr>
+                <w:lang w:val="sv-SE"/>
+              </w:rPr>
+              <w:t xml:space="preserve">töms, </w:t>
+            </w:r>
+            <w:r>
+              <w:rPr>
+                <w:lang w:val="sv-SE"/>
+              </w:rPr>
+              <w:t xml:space="preserve">och fältet </w:t>
+            </w:r>
+            <w:r>
+              <w:rPr>
+                <w:lang w:val="sv-SE"/>
+              </w:rPr>
+              <w:t xml:space="preserve">görs </w:t>
+            </w:r>
+            <w:proofErr w:type="spellStart"/>
+            <w:r>
+              <w:rPr>
+                <w:lang w:val="sv-SE"/>
+              </w:rPr>
+              <w:t>redigerbart</w:t>
+            </w:r>
+            <w:proofErr w:type="spellEnd"/>
+            <w:r>
+              <w:rPr>
+                <w:lang w:val="sv-SE"/>
+              </w:rPr>
+              <w:t>.</w:t>
+            </w:r>
+            <w:r>
+              <w:rPr>
+                <w:lang w:val="sv-SE"/>
+              </w:rPr>
+              <w:t xml:space="preserve"> </w:t>
+            </w:r>
+            <w:proofErr w:type="gramStart"/>
+            <w:r>
+              <w:rPr>
+                <w:lang w:val="sv-SE"/>
+              </w:rPr>
+              <w:t>Strängare</w:t>
+            </w:r>
+            <w:proofErr w:type="gramEnd"/>
+            <w:r>
+              <w:rPr>
+                <w:lang w:val="sv-SE"/>
+              </w:rPr>
+              <w:t xml:space="preserve"> kontroll före sparande/beräkning som ger dialogruta med valet att ändra felaktigt datum eller gå vidare, om går vidare </w:t>
             </w:r>
             <w:r>
               <w:rPr>
@@ -1203,13 +1292,7 @@
               <w:rPr>
                 <w:lang w:val="sv-SE"/>
               </w:rPr>
-              <w:t xml:space="preserve">. </w:t>
-            </w:r>
-            <w:r>
-              <w:rPr>
-                <w:lang w:val="sv-SE"/>
-              </w:rPr>
-              <w:t>Tecken i Windows-1252 hanteras (varna ej om felaktiga tecken, men ta inte emot tecken som hotar integriteten till en-</w:t>
+              <w:t>. Tecken i Windows-1252 hanteras (varna ej om felaktiga tecken, men ta inte emot tecken som hotar integriteten till en-</w:t>
             </w:r>
             <w:proofErr w:type="spellStart"/>
             <w:r>
@@ -1310,13 +1393,7 @@
               <w:rPr>
                 <w:lang w:val="sv-SE"/>
               </w:rPr>
-              <w:t xml:space="preserve">. </w:t>
-            </w:r>
-            <w:r>
-              <w:rPr>
-                <w:lang w:val="sv-SE"/>
-              </w:rPr>
-              <w:t>Tecken i Windows-1252 hanteras (varna ej om felaktiga tecken, men ta inte emot tecken som hotar integriteten till en-</w:t>
+              <w:t>. Tecken i Windows-1252 hanteras (varna ej om felaktiga tecken, men ta inte emot tecken som hotar integriteten till en-</w:t>
             </w:r>
             <w:proofErr w:type="spellStart"/>
             <w:r>
@@ -1340,13 +1417,7 @@
           </w:tcPr>
           <w:p>
             <w:r>
-              <w:t xml:space="preserve">Rad </w:t>
-            </w:r>
-            <w:r>
-              <w:t>7</w:t>
-            </w:r>
-            <w:r>
-              <w:t>.</w:t>
+              <w:t>Rad 7.</w:t>
             </w:r>
           </w:p>
         </w:tc>
@@ -1437,13 +1508,7 @@
               <w:rPr>
                 <w:lang w:val="sv-SE"/>
               </w:rPr>
-              <w:t>Rad 8.</w:t>
-            </w:r>
-            <w:r>
-              <w:rPr>
-                <w:lang w:val="sv-SE"/>
-              </w:rPr>
-              <w:t xml:space="preserve"> Måste vara en textsträng som är exakt 50 tecken lång</w:t>
+              <w:t>Rad 8. Måste vara en textsträng som är exakt 50 tecken lång</w:t>
             </w:r>
             <w:r>
               <w:rPr>
@@ -1461,20 +1526,20 @@
               <w:rPr>
                 <w:lang w:val="sv-SE"/>
               </w:rPr>
-              <w:t>representeras som ”*” (asterisk) i textsträngen. Icke-tomt fält representeras med tecknet som fältet innehåller</w:t>
-            </w:r>
-            <w:r>
-              <w:rPr>
-                <w:lang w:val="sv-SE"/>
-              </w:rPr>
-              <w:t xml:space="preserve">, där alla skrivbara Windows-1252-tecken godtas, inte bara de </w:t>
+              <w:t xml:space="preserve">representeras som ”*” (asterisk) i </w:t>
             </w:r>
             <w:r>
               <w:rPr>
                 <w:lang w:val="sv-SE"/>
               </w:rPr>
               <w:lastRenderedPageBreak/>
-              <w:t>beräkningsbara värdena 0, 1 eller 2</w:t>
+              <w:t>textsträngen. Icke-tomt fält representeras med tecknet som fältet innehåller</w:t>
+            </w:r>
+            <w:r>
+              <w:rPr>
+                <w:lang w:val="sv-SE"/>
+              </w:rPr>
+              <w:t>, där alla skrivbara Windows-1252-tecken godtas, inte bara de beräkningsbara värdena 0, 1 eller 2</w:t>
             </w:r>
             <w:r>
               <w:rPr>
@@ -1629,13 +1694,7 @@
         <w:rPr>
           <w:lang w:val="sv-SE"/>
         </w:rPr>
-        <w:t xml:space="preserve">Detta är data som skapas från registreringsdata när en beräkning ska göras. </w:t>
-      </w:r>
-      <w:r>
-        <w:rPr>
-          <w:lang w:val="sv-SE"/>
-        </w:rPr>
-        <w:t>De får bearbetas utan att originaluppgifterna ändras.</w:t>
+        <w:t>Detta är data som skapas från registreringsdata när en beräkning ska göras. De får bearbetas utan att originaluppgifterna ändras.</w:t>
       </w:r>
     </w:p>
     <w:tbl>
@@ -1861,13 +1920,7 @@
               <w:rPr>
                 <w:lang w:val="sv-SE"/>
               </w:rPr>
-              <w:t xml:space="preserve">Anger om </w:t>
-            </w:r>
-            <w:r>
-              <w:rPr>
-                <w:lang w:val="sv-SE"/>
-              </w:rPr>
-              <w:t xml:space="preserve">giltig </w:t>
+              <w:t xml:space="preserve">Anger om giltig </w:t>
             </w:r>
             <w:r>
               <w:rPr>
@@ -1904,6 +1957,7 @@
               <w:rPr>
                 <w:lang w:val="sv-SE"/>
               </w:rPr>
+              <w:lastRenderedPageBreak/>
               <w:t>Ursprungliga uppgiftspoäng</w:t>
             </w:r>
           </w:p>
@@ -2034,7 +2088,6 @@
               <w:rPr>
                 <w:lang w:val="sv-SE"/>
               </w:rPr>
-              <w:lastRenderedPageBreak/>
               <w:t>Bearbetad uppgiftssträng</w:t>
             </w:r>
           </w:p>
@@ -2093,20 +2146,17 @@
           <w:p>
             <w:pPr>
               <w:rPr>
-                <w:highlight w:val="yellow"/>
-                <w:lang w:val="sv-SE"/>
-              </w:rPr>
-            </w:pPr>
-            <w:r>
-              <w:rPr>
-                <w:highlight w:val="yellow"/>
+                <w:lang w:val="sv-SE"/>
+              </w:rPr>
+            </w:pPr>
+            <w:r>
+              <w:rPr>
                 <w:lang w:val="sv-SE"/>
               </w:rPr>
               <w:t xml:space="preserve">Antal </w:t>
             </w:r>
             <w:r>
               <w:rPr>
-                <w:highlight w:val="yellow"/>
                 <w:lang w:val="sv-SE"/>
               </w:rPr>
               <w:t>giltiga uppgifter</w:t>
@@ -2122,13 +2172,11 @@
           <w:p>
             <w:pPr>
               <w:rPr>
-                <w:highlight w:val="yellow"/>
-                <w:lang w:val="sv-SE"/>
-              </w:rPr>
-            </w:pPr>
-            <w:r>
-              <w:rPr>
-                <w:highlight w:val="yellow"/>
+                <w:lang w:val="sv-SE"/>
+              </w:rPr>
+            </w:pPr>
+            <w:r>
+              <w:rPr>
                 <w:lang w:val="sv-SE"/>
               </w:rPr>
               <w:t>Bearbetad uppgiftssträng</w:t>
@@ -2149,63 +2197,54 @@
             </w:pPr>
             <w:r>
               <w:rPr>
-                <w:highlight w:val="yellow"/>
                 <w:lang w:val="sv-SE"/>
               </w:rPr>
               <w:t>Antal av de 50 uppgifterna i den bearbetade uppgiftssträngen som</w:t>
             </w:r>
             <w:r>
               <w:rPr>
-                <w:highlight w:val="yellow"/>
                 <w:lang w:val="sv-SE"/>
               </w:rPr>
               <w:t xml:space="preserve"> har ett giltigt värde (</w:t>
             </w:r>
             <w:r>
               <w:rPr>
-                <w:highlight w:val="yellow"/>
                 <w:lang w:val="sv-SE"/>
               </w:rPr>
               <w:t>0, 1,</w:t>
             </w:r>
             <w:r>
               <w:rPr>
-                <w:highlight w:val="yellow"/>
                 <w:lang w:val="sv-SE"/>
               </w:rPr>
               <w:t xml:space="preserve"> eller</w:t>
             </w:r>
             <w:r>
               <w:rPr>
-                <w:highlight w:val="yellow"/>
                 <w:lang w:val="sv-SE"/>
               </w:rPr>
               <w:t xml:space="preserve"> 2</w:t>
             </w:r>
             <w:r>
               <w:rPr>
-                <w:highlight w:val="yellow"/>
                 <w:lang w:val="sv-SE"/>
               </w:rPr>
               <w:t>)</w:t>
             </w:r>
             <w:r>
               <w:rPr>
-                <w:highlight w:val="yellow"/>
                 <w:lang w:val="sv-SE"/>
               </w:rPr>
               <w:t>.</w:t>
             </w:r>
             <w:r>
               <w:rPr>
-                <w:highlight w:val="yellow"/>
                 <w:lang w:val="sv-SE"/>
               </w:rPr>
               <w:t xml:space="preserve"> Antalet måste vara minst 3 för att resultat ska beräknas och visas. Om </w:t>
             </w:r>
             <w:r>
               <w:rPr>
-                <w:highlight w:val="yellow"/>
                 <w:lang w:val="sv-SE"/>
               </w:rPr>
               <w:t xml:space="preserve">antalet är </w:t>
@@ -2213,7 +2252,6 @@
             <w:proofErr w:type="gramStart"/>
             <w:r>
               <w:rPr>
-                <w:highlight w:val="yellow"/>
                 <w:lang w:val="sv-SE"/>
               </w:rPr>
               <w:t>0-2</w:t>
@@ -2221,14 +2259,12 @@
             <w:proofErr w:type="gramEnd"/>
             <w:r>
               <w:rPr>
-                <w:highlight w:val="yellow"/>
                 <w:lang w:val="sv-SE"/>
               </w:rPr>
               <w:t xml:space="preserve"> ska resultatbilden inte visas och en varningstext/dialog </w:t>
             </w:r>
             <w:r>
               <w:rPr>
-                <w:highlight w:val="yellow"/>
                 <w:lang w:val="sv-SE"/>
               </w:rPr>
               <w:t>som talar om att resultat inte kan beräknas när antalet gjorda uppgifter är mindre än 3.</w:t>
@@ -2485,6 +2521,7 @@
           <w:p>
             <w:proofErr w:type="spellStart"/>
             <w:r>
+              <w:lastRenderedPageBreak/>
               <w:t>Modellbaserad</w:t>
             </w:r>
             <w:proofErr w:type="spellEnd"/>
@@ -2552,19 +2589,7 @@
               <w:rPr>
                 <w:lang w:val="sv-SE"/>
               </w:rPr>
-              <w:t xml:space="preserve">. </w:t>
-            </w:r>
-            <w:r>
-              <w:rPr>
-                <w:lang w:val="sv-SE"/>
-              </w:rPr>
-              <w:t>O</w:t>
-            </w:r>
-            <w:r>
-              <w:rPr>
-                <w:lang w:val="sv-SE"/>
-              </w:rPr>
-              <w:t>m korrekt numerisk ålder inte finns, visas inte modellbaserad percentil</w:t>
+              <w:t>. Om korrekt numerisk ålder inte finns, visas inte modellbaserad percentil</w:t>
             </w:r>
             <w:r>
               <w:rPr>
@@ -2600,13 +2625,7 @@
               <w:rPr>
                 <w:lang w:val="sv-SE"/>
               </w:rPr>
-              <w:t>ns ol</w:t>
-            </w:r>
-            <w:r>
-              <w:rPr>
-                <w:lang w:val="sv-SE"/>
-              </w:rPr>
-              <w:t>ika åldersklasser</w:t>
+              <w:t>ns olika åldersklasser</w:t>
             </w:r>
           </w:p>
         </w:tc>
@@ -2682,7 +2701,6 @@
               <w:rPr>
                 <w:lang w:val="nb-NO"/>
               </w:rPr>
-              <w:lastRenderedPageBreak/>
               <w:t xml:space="preserve">Rapportens </w:t>
             </w:r>
             <w:proofErr w:type="spellStart"/>
@@ -2697,13 +2715,7 @@
               <w:rPr>
                 <w:lang w:val="nb-NO"/>
               </w:rPr>
-              <w:t>, Navn, Gutt, J</w:t>
-            </w:r>
-            <w:r>
-              <w:rPr>
-                <w:lang w:val="nb-NO"/>
-              </w:rPr>
-              <w:t>ente, Alder (</w:t>
+              <w:t>, Navn, Gutt, Jente, Alder (</w:t>
             </w:r>
             <w:proofErr w:type="spellStart"/>
             <w:r>
@@ -3132,7 +3144,6 @@
           <w:p>
             <w:proofErr w:type="spellStart"/>
             <w:r>
-              <w:lastRenderedPageBreak/>
               <w:t>Referenskopia</w:t>
             </w:r>
             <w:proofErr w:type="spellEnd"/>
@@ -3416,13 +3427,7 @@
               <w:rPr>
                 <w:lang w:val="sv-SE"/>
               </w:rPr>
-              <w:t xml:space="preserve"> o</w:t>
-            </w:r>
-            <w:r>
-              <w:rPr>
-                <w:lang w:val="sv-SE"/>
-              </w:rPr>
-              <w:t xml:space="preserve">m </w:t>
+              <w:t xml:space="preserve"> om </w:t>
             </w:r>
             <w:r>
               <w:rPr>
@@ -3453,6 +3458,7 @@
               <w:rPr>
                 <w:lang w:val="sv-SE"/>
               </w:rPr>
+              <w:lastRenderedPageBreak/>
               <w:t>Ny fil/öppna fil/stäng registrering</w:t>
             </w:r>
           </w:p>
@@ -4255,7 +4261,6 @@
   <w:style w:type="character" w:default="1" w:styleId="DefaultParagraphFont">
     <w:name w:val="Default Paragraph Font"/>
     <w:uiPriority w:val="1"/>
-    <w:semiHidden/>
     <w:unhideWhenUsed/>
   </w:style>
   <w:style w:type="table" w:default="1" w:styleId="TableNormal">

</xml_diff>